<commit_message>
Usere and Doctor Login
</commit_message>
<xml_diff>
--- a/Frequently Used.docx
+++ b/Frequently Used.docx
@@ -19,13 +19,7 @@
     </w:p>
     <w:p>
       <w:r>
-        <w:t>Port (beside Terminal) -&gt; 8001 -&gt;</w:t>
-      </w:r>
-      <w:r>
-        <w:t xml:space="preserve"> </w:t>
-      </w:r>
-      <w:r>
-        <w:t>Visibility: Public</w:t>
+        <w:t>Port (beside Terminal) -&gt; 8001 -&gt; Visibility: Public</w:t>
       </w:r>
     </w:p>
     <w:p>
@@ -63,8 +57,13 @@
     </w:p>
     <w:p>
       <w:r>
-        <w:t>python manage.py runserver</w:t>
-      </w:r>
+        <w:t xml:space="preserve">python manage.py </w:t>
+      </w:r>
+      <w:proofErr w:type="spellStart"/>
+      <w:r>
+        <w:t>runserver</w:t>
+      </w:r>
+      <w:proofErr w:type="spellEnd"/>
       <w:r>
         <w:t xml:space="preserve"> 8001</w:t>
       </w:r>
@@ -77,104 +76,6 @@
           <w:bCs/>
         </w:rPr>
         <w:t>Admin Login URL:</w:t>
-      </w:r>
-      <w:r>
-        <w:rPr>
-          <w:b/>
-          <w:bCs/>
-        </w:rPr>
-        <w:t xml:space="preserve"> </w:t>
-      </w:r>
-      <w:hyperlink r:id="rId4" w:history="1">
-        <w:r>
-          <w:rPr>
-            <w:rStyle w:val="Hyperlink"/>
-          </w:rPr>
-          <w:t>http://12</w:t>
-        </w:r>
-        <w:r>
-          <w:rPr>
-            <w:rStyle w:val="Hyperlink"/>
-          </w:rPr>
-          <w:t>7</w:t>
-        </w:r>
-        <w:r>
-          <w:rPr>
-            <w:rStyle w:val="Hyperlink"/>
-          </w:rPr>
-          <w:t>.0</w:t>
-        </w:r>
-        <w:r>
-          <w:rPr>
-            <w:rStyle w:val="Hyperlink"/>
-          </w:rPr>
-          <w:t>.</w:t>
-        </w:r>
-        <w:r>
-          <w:rPr>
-            <w:rStyle w:val="Hyperlink"/>
-          </w:rPr>
-          <w:t>0.1:8001/admin/login/</w:t>
-        </w:r>
-      </w:hyperlink>
-    </w:p>
-    <w:p/>
-    <w:p>
-      <w:r>
-        <w:rPr>
-          <w:b/>
-          <w:bCs/>
-        </w:rPr>
-        <w:t>Registration</w:t>
-      </w:r>
-      <w:r>
-        <w:rPr>
-          <w:b/>
-          <w:bCs/>
-        </w:rPr>
-        <w:t>/Login/Edit</w:t>
-      </w:r>
-      <w:r>
-        <w:rPr>
-          <w:b/>
-          <w:bCs/>
-        </w:rPr>
-        <w:t xml:space="preserve"> Page</w:t>
-      </w:r>
-      <w:r>
-        <w:rPr>
-          <w:b/>
-          <w:bCs/>
-        </w:rPr>
-        <w:t xml:space="preserve"> </w:t>
-      </w:r>
-      <w:r>
-        <w:rPr>
-          <w:b/>
-          <w:bCs/>
-        </w:rPr>
-        <w:t>(</w:t>
-      </w:r>
-      <w:r>
-        <w:rPr>
-          <w:b/>
-          <w:bCs/>
-        </w:rPr>
-        <w:t>Doctor</w:t>
-      </w:r>
-      <w:r>
-        <w:rPr>
-          <w:b/>
-          <w:bCs/>
-        </w:rPr>
-        <w:t>)</w:t>
-      </w:r>
-      <w:r>
-        <w:rPr>
-          <w:b/>
-          <w:bCs/>
-        </w:rPr>
-        <w:t>:</w:t>
       </w:r>
       <w:r>
         <w:rPr>
@@ -188,31 +89,53 @@
           <w:rPr>
             <w:rStyle w:val="Hyperlink"/>
           </w:rPr>
-          <w:t>http://1</w:t>
+          <w:t>http://127.0.0.1:8001/admin/login/</w:t>
         </w:r>
+      </w:hyperlink>
+    </w:p>
+    <w:p/>
+    <w:p>
+      <w:r>
+        <w:rPr>
+          <w:b/>
+          <w:bCs/>
+        </w:rPr>
+        <w:t xml:space="preserve">Doctor - </w:t>
+      </w:r>
+      <w:r>
+        <w:rPr>
+          <w:b/>
+          <w:bCs/>
+        </w:rPr>
+        <w:t>Registration</w:t>
+      </w:r>
+      <w:r>
+        <w:rPr>
+          <w:b/>
+          <w:bCs/>
+        </w:rPr>
+        <w:t>/Login/Edit</w:t>
+      </w:r>
+      <w:r>
+        <w:rPr>
+          <w:b/>
+          <w:bCs/>
+        </w:rPr>
+        <w:t xml:space="preserve"> Page:</w:t>
+      </w:r>
+      <w:r>
+        <w:rPr>
+          <w:b/>
+          <w:bCs/>
+        </w:rPr>
+        <w:t xml:space="preserve"> </w:t>
+      </w:r>
+      <w:hyperlink r:id="rId6" w:history="1">
         <w:r>
           <w:rPr>
             <w:rStyle w:val="Hyperlink"/>
           </w:rPr>
-          <w:t>2</w:t>
-        </w:r>
-        <w:r>
-          <w:rPr>
-            <w:rStyle w:val="Hyperlink"/>
-          </w:rPr>
-          <w:t>7.0.0.1:</w:t>
-        </w:r>
-        <w:r>
-          <w:rPr>
-            <w:rStyle w:val="Hyperlink"/>
-          </w:rPr>
-          <w:t>8</w:t>
-        </w:r>
-        <w:r>
-          <w:rPr>
-            <w:rStyle w:val="Hyperlink"/>
-          </w:rPr>
-          <w:t>001/admin/doctor_registration_page/</w:t>
+          <w:t>http://127.0.0.1:8001/admin/doctor_registration_page/</w:t>
         </w:r>
       </w:hyperlink>
     </w:p>
@@ -230,6 +153,13 @@
           <w:b/>
           <w:bCs/>
         </w:rPr>
+        <w:t xml:space="preserve">User - </w:t>
+      </w:r>
+      <w:r>
+        <w:rPr>
+          <w:b/>
+          <w:bCs/>
+        </w:rPr>
         <w:t>Registration</w:t>
       </w:r>
       <w:r>
@@ -244,33 +174,12 @@
           <w:b/>
           <w:bCs/>
         </w:rPr>
-        <w:t xml:space="preserve"> Page</w:t>
-      </w:r>
-      <w:r>
-        <w:rPr>
-          <w:b/>
-          <w:bCs/>
-        </w:rPr>
+        <w:t xml:space="preserve"> Page:</w:t>
+      </w:r>
+      <w:r>
         <w:t xml:space="preserve"> </w:t>
       </w:r>
-      <w:r>
-        <w:rPr>
-          <w:b/>
-          <w:bCs/>
-        </w:rPr>
-        <w:t>(User)</w:t>
-      </w:r>
-      <w:r>
-        <w:rPr>
-          <w:b/>
-          <w:bCs/>
-        </w:rPr>
-        <w:t>:</w:t>
-      </w:r>
-      <w:r>
-        <w:t xml:space="preserve"> </w:t>
-      </w:r>
-      <w:hyperlink r:id="rId6" w:history="1">
+      <w:hyperlink r:id="rId7" w:history="1">
         <w:r>
           <w:rPr>
             <w:rStyle w:val="Hyperlink"/>
@@ -299,13 +208,27 @@
           <w:b/>
           <w:bCs/>
         </w:rPr>
-        <w:t>sh to Github</w:t>
-      </w:r>
-    </w:p>
-    <w:p>
-      <w:r>
-        <w:t>E:\serene_space&gt;git add .</w:t>
-      </w:r>
+        <w:t xml:space="preserve">sh to </w:t>
+      </w:r>
+      <w:proofErr w:type="spellStart"/>
+      <w:r>
+        <w:rPr>
+          <w:b/>
+          <w:bCs/>
+        </w:rPr>
+        <w:t>Github</w:t>
+      </w:r>
+      <w:proofErr w:type="spellEnd"/>
+    </w:p>
+    <w:p>
+      <w:r>
+        <w:t xml:space="preserve">E:\serene_space&gt;git </w:t>
+      </w:r>
+      <w:proofErr w:type="gramStart"/>
+      <w:r>
+        <w:t>add .</w:t>
+      </w:r>
+      <w:proofErr w:type="gramEnd"/>
     </w:p>
     <w:p>
       <w:r>
@@ -335,7 +258,9 @@
           <w:szCs w:val="60"/>
         </w:rPr>
       </w:pPr>
-      <w:r>
+    </w:p>
+    <w:p>
+      <w:pPr>
         <w:rPr>
           <w:b/>
           <w:bCs/>
@@ -343,47 +268,147 @@
           <w:sz w:val="60"/>
           <w:szCs w:val="60"/>
         </w:rPr>
+      </w:pPr>
+      <w:r>
+        <w:rPr>
+          <w:b/>
+          <w:bCs/>
+          <w:color w:val="EE0000"/>
+          <w:sz w:val="60"/>
+          <w:szCs w:val="60"/>
+        </w:rPr>
+        <w:lastRenderedPageBreak/>
         <w:t>To Do</w:t>
       </w:r>
     </w:p>
     <w:p>
       <w:pPr>
-        <w:rPr>
-          <w:b/>
-          <w:bCs/>
-        </w:rPr>
-      </w:pPr>
-      <w:r>
-        <w:rPr>
-          <w:b/>
-          <w:bCs/>
-        </w:rPr>
-        <w:lastRenderedPageBreak/>
-        <w:t>Create Backup Folder</w:t>
-      </w:r>
-    </w:p>
-    <w:p>
-      <w:pPr>
-        <w:rPr>
-          <w:b/>
-          <w:bCs/>
-        </w:rPr>
-      </w:pPr>
-      <w:r>
-        <w:rPr>
-          <w:b/>
-          <w:bCs/>
-        </w:rPr>
-        <w:t>In Dashboard -&gt; Total Doctors, Pending Approvals Stats not showing</w:t>
-      </w:r>
-    </w:p>
-    <w:p>
-      <w:r>
-        <w:rPr>
-          <w:b/>
-          <w:bCs/>
-        </w:rPr>
-        <w:t>Manage Doctors and Manage Users -&gt; Change Id Column to Sl. No. Like in Dashboard</w:t>
+        <w:pStyle w:val="ListParagraph"/>
+        <w:numPr>
+          <w:ilvl w:val="0"/>
+          <w:numId w:val="1"/>
+        </w:numPr>
+        <w:rPr>
+          <w:b/>
+          <w:bCs/>
+        </w:rPr>
+      </w:pPr>
+      <w:r>
+        <w:rPr>
+          <w:b/>
+          <w:bCs/>
+        </w:rPr>
+        <w:t>Push to Git Hub</w:t>
+      </w:r>
+    </w:p>
+    <w:p>
+      <w:pPr>
+        <w:pStyle w:val="ListParagraph"/>
+        <w:numPr>
+          <w:ilvl w:val="0"/>
+          <w:numId w:val="1"/>
+        </w:numPr>
+        <w:rPr>
+          <w:b/>
+          <w:bCs/>
+        </w:rPr>
+      </w:pPr>
+      <w:r>
+        <w:rPr>
+          <w:b/>
+          <w:bCs/>
+        </w:rPr>
+        <w:t xml:space="preserve">One Admin (a with a@gmail.com) in users list. Another Admin with </w:t>
+      </w:r>
+      <w:hyperlink r:id="rId8" w:history="1">
+        <w:r>
+          <w:rPr>
+            <w:rStyle w:val="Hyperlink"/>
+            <w:b/>
+            <w:bCs/>
+          </w:rPr>
+          <w:t>admin@gmail.com</w:t>
+        </w:r>
+      </w:hyperlink>
+    </w:p>
+    <w:p>
+      <w:pPr>
+        <w:pStyle w:val="ListParagraph"/>
+        <w:numPr>
+          <w:ilvl w:val="0"/>
+          <w:numId w:val="1"/>
+        </w:numPr>
+        <w:rPr>
+          <w:b/>
+          <w:bCs/>
+        </w:rPr>
+      </w:pPr>
+      <w:r>
+        <w:rPr>
+          <w:b/>
+          <w:bCs/>
+        </w:rPr>
+        <w:t>Fix database configuration (MySQL vs SQLite)</w:t>
+      </w:r>
+    </w:p>
+    <w:p>
+      <w:pPr>
+        <w:pStyle w:val="ListParagraph"/>
+        <w:rPr>
+          <w:b/>
+          <w:bCs/>
+        </w:rPr>
+      </w:pPr>
+    </w:p>
+    <w:p>
+      <w:pPr>
+        <w:pStyle w:val="ListParagraph"/>
+        <w:rPr>
+          <w:b/>
+          <w:bCs/>
+        </w:rPr>
+      </w:pPr>
+    </w:p>
+    <w:p>
+      <w:r>
+        <w:rPr>
+          <w:noProof/>
+        </w:rPr>
+        <w:drawing>
+          <wp:inline distT="0" distB="0" distL="0" distR="0" wp14:anchorId="6906AE0B" wp14:editId="3EDC879E">
+            <wp:extent cx="9777730" cy="3923665"/>
+            <wp:effectExtent l="0" t="0" r="0" b="635"/>
+            <wp:docPr id="50341292" name="Picture 1"/>
+            <wp:cNvGraphicFramePr>
+              <a:graphicFrameLocks xmlns:a="http://schemas.openxmlformats.org/drawingml/2006/main" noChangeAspect="1"/>
+            </wp:cNvGraphicFramePr>
+            <a:graphic xmlns:a="http://schemas.openxmlformats.org/drawingml/2006/main">
+              <a:graphicData uri="http://schemas.openxmlformats.org/drawingml/2006/picture">
+                <pic:pic xmlns:pic="http://schemas.openxmlformats.org/drawingml/2006/picture">
+                  <pic:nvPicPr>
+                    <pic:cNvPr id="50341292" name=""/>
+                    <pic:cNvPicPr/>
+                  </pic:nvPicPr>
+                  <pic:blipFill>
+                    <a:blip r:embed="rId9"/>
+                    <a:stretch>
+                      <a:fillRect/>
+                    </a:stretch>
+                  </pic:blipFill>
+                  <pic:spPr>
+                    <a:xfrm>
+                      <a:off x="0" y="0"/>
+                      <a:ext cx="9777730" cy="3923665"/>
+                    </a:xfrm>
+                    <a:prstGeom prst="rect">
+                      <a:avLst/>
+                    </a:prstGeom>
+                  </pic:spPr>
+                </pic:pic>
+              </a:graphicData>
+            </a:graphic>
+          </wp:inline>
+        </w:drawing>
       </w:r>
     </w:p>
     <w:sectPr>
@@ -394,6 +419,103 @@
     </w:sectPr>
   </w:body>
 </w:document>
+</file>
+
+<file path=word/numbering.xml><?xml version="1.0" encoding="utf-8"?>
+<w:numbering xmlns:wpc="http://schemas.microsoft.com/office/word/2010/wordprocessingCanvas" xmlns:cx="http://schemas.microsoft.com/office/drawing/2014/chartex" xmlns:cx1="http://schemas.microsoft.com/office/drawing/2015/9/8/chartex" xmlns:cx2="http://schemas.microsoft.com/office/drawing/2015/10/21/chartex" xmlns:cx3="http://schemas.microsoft.com/office/drawing/2016/5/9/chartex" xmlns:cx4="http://schemas.microsoft.com/office/drawing/2016/5/10/chartex" xmlns:cx5="http://schemas.microsoft.com/office/drawing/2016/5/11/chartex" xmlns:cx6="http://schemas.microsoft.com/office/drawing/2016/5/12/chartex" xmlns:cx7="http://schemas.microsoft.com/office/drawing/2016/5/13/chartex" xmlns:cx8="http://schemas.microsoft.com/office/drawing/2016/5/14/chartex" xmlns:mc="http://schemas.openxmlformats.org/markup-compatibility/2006" xmlns:aink="http://schemas.microsoft.com/office/drawing/2016/ink" xmlns:am3d="http://schemas.microsoft.com/office/drawing/2017/model3d" xmlns:o="urn:schemas-microsoft-com:office:office" xmlns:oel="http://schemas.microsoft.com/office/2019/extlst" xmlns:r="http://schemas.openxmlformats.org/officeDocument/2006/relationships" xmlns:m="http://schemas.openxmlformats.org/officeDocument/2006/math" xmlns:v="urn:schemas-microsoft-com:vml" xmlns:wp14="http://schemas.microsoft.com/office/word/2010/wordprocessingDrawing" xmlns:wp="http://schemas.openxmlformats.org/drawingml/2006/wordprocessingDrawing" xmlns:w10="urn:schemas-microsoft-com:office:word" xmlns:w="http://schemas.openxmlformats.org/wordprocessingml/2006/main" xmlns:w14="http://schemas.microsoft.com/office/word/2010/wordml" xmlns:w15="http://schemas.microsoft.com/office/word/2012/wordml" xmlns:w16cex="http://schemas.microsoft.com/office/word/2018/wordml/cex" xmlns:w16cid="http://schemas.microsoft.com/office/word/2016/wordml/cid" xmlns:w16="http://schemas.microsoft.com/office/word/2018/wordml" xmlns:w16du="http://schemas.microsoft.com/office/word/2023/wordml/word16du" xmlns:w16sdtdh="http://schemas.microsoft.com/office/word/2020/wordml/sdtdatahash" xmlns:w16sdtfl="http://schemas.microsoft.com/office/word/2024/wordml/sdtformatlock" xmlns:w16se="http://schemas.microsoft.com/office/word/2015/wordml/symex" xmlns:wpg="http://schemas.microsoft.com/office/word/2010/wordprocessingGroup" xmlns:wpi="http://schemas.microsoft.com/office/word/2010/wordprocessingInk" xmlns:wne="http://schemas.microsoft.com/office/word/2006/wordml" xmlns:wps="http://schemas.microsoft.com/office/word/2010/wordprocessingShape" mc:Ignorable="w14 w15 w16se w16cid w16 w16cex w16sdtdh w16sdtfl w16du wp14">
+  <w:abstractNum w:abstractNumId="0" w15:restartNumberingAfterBreak="0">
+    <w:nsid w:val="2E3F7448"/>
+    <w:multiLevelType w:val="hybridMultilevel"/>
+    <w:tmpl w:val="C660F5AE"/>
+    <w:lvl w:ilvl="0" w:tplc="4009000F">
+      <w:start w:val="1"/>
+      <w:numFmt w:val="decimal"/>
+      <w:lvlText w:val="%1."/>
+      <w:lvlJc w:val="left"/>
+      <w:pPr>
+        <w:ind w:left="720" w:hanging="360"/>
+      </w:pPr>
+      <w:rPr>
+        <w:rFonts w:hint="default"/>
+      </w:rPr>
+    </w:lvl>
+    <w:lvl w:ilvl="1" w:tplc="40090019" w:tentative="1">
+      <w:start w:val="1"/>
+      <w:numFmt w:val="lowerLetter"/>
+      <w:lvlText w:val="%2."/>
+      <w:lvlJc w:val="left"/>
+      <w:pPr>
+        <w:ind w:left="1440" w:hanging="360"/>
+      </w:pPr>
+    </w:lvl>
+    <w:lvl w:ilvl="2" w:tplc="4009001B" w:tentative="1">
+      <w:start w:val="1"/>
+      <w:numFmt w:val="lowerRoman"/>
+      <w:lvlText w:val="%3."/>
+      <w:lvlJc w:val="right"/>
+      <w:pPr>
+        <w:ind w:left="2160" w:hanging="180"/>
+      </w:pPr>
+    </w:lvl>
+    <w:lvl w:ilvl="3" w:tplc="4009000F" w:tentative="1">
+      <w:start w:val="1"/>
+      <w:numFmt w:val="decimal"/>
+      <w:lvlText w:val="%4."/>
+      <w:lvlJc w:val="left"/>
+      <w:pPr>
+        <w:ind w:left="2880" w:hanging="360"/>
+      </w:pPr>
+    </w:lvl>
+    <w:lvl w:ilvl="4" w:tplc="40090019" w:tentative="1">
+      <w:start w:val="1"/>
+      <w:numFmt w:val="lowerLetter"/>
+      <w:lvlText w:val="%5."/>
+      <w:lvlJc w:val="left"/>
+      <w:pPr>
+        <w:ind w:left="3600" w:hanging="360"/>
+      </w:pPr>
+    </w:lvl>
+    <w:lvl w:ilvl="5" w:tplc="4009001B" w:tentative="1">
+      <w:start w:val="1"/>
+      <w:numFmt w:val="lowerRoman"/>
+      <w:lvlText w:val="%6."/>
+      <w:lvlJc w:val="right"/>
+      <w:pPr>
+        <w:ind w:left="4320" w:hanging="180"/>
+      </w:pPr>
+    </w:lvl>
+    <w:lvl w:ilvl="6" w:tplc="4009000F" w:tentative="1">
+      <w:start w:val="1"/>
+      <w:numFmt w:val="decimal"/>
+      <w:lvlText w:val="%7."/>
+      <w:lvlJc w:val="left"/>
+      <w:pPr>
+        <w:ind w:left="5040" w:hanging="360"/>
+      </w:pPr>
+    </w:lvl>
+    <w:lvl w:ilvl="7" w:tplc="40090019" w:tentative="1">
+      <w:start w:val="1"/>
+      <w:numFmt w:val="lowerLetter"/>
+      <w:lvlText w:val="%8."/>
+      <w:lvlJc w:val="left"/>
+      <w:pPr>
+        <w:ind w:left="5760" w:hanging="360"/>
+      </w:pPr>
+    </w:lvl>
+    <w:lvl w:ilvl="8" w:tplc="4009001B" w:tentative="1">
+      <w:start w:val="1"/>
+      <w:numFmt w:val="lowerRoman"/>
+      <w:lvlText w:val="%9."/>
+      <w:lvlJc w:val="right"/>
+      <w:pPr>
+        <w:ind w:left="6480" w:hanging="180"/>
+      </w:pPr>
+    </w:lvl>
+  </w:abstractNum>
+  <w:num w:numId="1" w16cid:durableId="1153913156">
+    <w:abstractNumId w:val="0"/>
+  </w:num>
+</w:numbering>
 </file>
 
 <file path=word/styles.xml><?xml version="1.0" encoding="utf-8"?>
@@ -999,7 +1121,6 @@
   <w:style w:type="character" w:default="1" w:styleId="DefaultParagraphFont">
     <w:name w:val="Default Paragraph Font"/>
     <w:uiPriority w:val="1"/>
-    <w:semiHidden/>
     <w:unhideWhenUsed/>
   </w:style>
   <w:style w:type="table" w:default="1" w:styleId="TableNormal">

</xml_diff>

<commit_message>
Remove venv folder and add .gitignore
</commit_message>
<xml_diff>
--- a/Frequently Used.docx
+++ b/Frequently Used.docx
@@ -14,6 +14,96 @@
           <w:b/>
           <w:bCs/>
         </w:rPr>
+        <w:t>Project Title:</w:t>
+      </w:r>
+    </w:p>
+    <w:p>
+      <w:pPr>
+        <w:rPr>
+          <w:b/>
+          <w:bCs/>
+        </w:rPr>
+      </w:pPr>
+      <w:r>
+        <w:rPr>
+          <w:b/>
+          <w:bCs/>
+        </w:rPr>
+        <w:t>Serene Space: Comprehensive AI-Powered Mental Wellness Platform</w:t>
+      </w:r>
+    </w:p>
+    <w:p>
+      <w:pPr>
+        <w:rPr>
+          <w:b/>
+          <w:bCs/>
+        </w:rPr>
+      </w:pPr>
+    </w:p>
+    <w:p>
+      <w:pPr>
+        <w:rPr>
+          <w:b/>
+          <w:bCs/>
+        </w:rPr>
+      </w:pPr>
+    </w:p>
+    <w:p>
+      <w:pPr>
+        <w:rPr>
+          <w:b/>
+          <w:bCs/>
+        </w:rPr>
+      </w:pPr>
+      <w:r>
+        <w:rPr>
+          <w:b/>
+          <w:bCs/>
+        </w:rPr>
+        <w:t>Django Super User</w:t>
+      </w:r>
+    </w:p>
+    <w:p>
+      <w:r>
+        <w:t>Name: serene</w:t>
+      </w:r>
+    </w:p>
+    <w:p>
+      <w:r>
+        <w:t xml:space="preserve">Email: </w:t>
+      </w:r>
+      <w:hyperlink r:id="rId5" w:history="1">
+        <w:r>
+          <w:rPr>
+            <w:rStyle w:val="Hyperlink"/>
+          </w:rPr>
+          <w:t>ananyasajan07@gmail.com</w:t>
+        </w:r>
+      </w:hyperlink>
+    </w:p>
+    <w:p>
+      <w:proofErr w:type="spellStart"/>
+      <w:r>
+        <w:t>Pwd</w:t>
+      </w:r>
+      <w:proofErr w:type="spellEnd"/>
+      <w:r>
+        <w:t>: serene</w:t>
+      </w:r>
+    </w:p>
+    <w:p/>
+    <w:p>
+      <w:pPr>
+        <w:rPr>
+          <w:b/>
+          <w:bCs/>
+        </w:rPr>
+      </w:pPr>
+      <w:r>
+        <w:rPr>
+          <w:b/>
+          <w:bCs/>
+        </w:rPr>
         <w:t>Frontend server</w:t>
       </w:r>
     </w:p>
@@ -84,7 +174,7 @@
         </w:rPr>
         <w:t xml:space="preserve"> </w:t>
       </w:r>
-      <w:hyperlink r:id="rId5" w:history="1">
+      <w:hyperlink r:id="rId6" w:history="1">
         <w:r>
           <w:rPr>
             <w:rStyle w:val="Hyperlink"/>
@@ -130,7 +220,7 @@
         </w:rPr>
         <w:t xml:space="preserve"> </w:t>
       </w:r>
-      <w:hyperlink r:id="rId6" w:history="1">
+      <w:hyperlink r:id="rId7" w:history="1">
         <w:r>
           <w:rPr>
             <w:rStyle w:val="Hyperlink"/>
@@ -153,6 +243,7 @@
           <w:b/>
           <w:bCs/>
         </w:rPr>
+        <w:lastRenderedPageBreak/>
         <w:t xml:space="preserve">User - </w:t>
       </w:r>
       <w:r>
@@ -179,7 +270,7 @@
       <w:r>
         <w:t xml:space="preserve"> </w:t>
       </w:r>
-      <w:hyperlink r:id="rId7" w:history="1">
+      <w:hyperlink r:id="rId8" w:history="1">
         <w:r>
           <w:rPr>
             <w:rStyle w:val="Hyperlink"/>
@@ -277,7 +368,6 @@
           <w:sz w:val="60"/>
           <w:szCs w:val="60"/>
         </w:rPr>
-        <w:lastRenderedPageBreak/>
         <w:t>To Do</w:t>
       </w:r>
     </w:p>
@@ -320,7 +410,7 @@
         </w:rPr>
         <w:t xml:space="preserve">One Admin (a with a@gmail.com) in users list. Another Admin with </w:t>
       </w:r>
-      <w:hyperlink r:id="rId8" w:history="1">
+      <w:hyperlink r:id="rId9" w:history="1">
         <w:r>
           <w:rPr>
             <w:rStyle w:val="Hyperlink"/>
@@ -341,14 +431,41 @@
         <w:rPr>
           <w:b/>
           <w:bCs/>
-        </w:rPr>
-      </w:pPr>
-      <w:r>
-        <w:rPr>
-          <w:b/>
-          <w:bCs/>
-        </w:rPr>
-        <w:t>Fix database configuration (MySQL vs SQLite)</w:t>
+          <w:color w:val="70AD47" w:themeColor="accent6"/>
+        </w:rPr>
+      </w:pPr>
+      <w:r>
+        <w:rPr>
+          <w:b/>
+          <w:bCs/>
+          <w:color w:val="70AD47" w:themeColor="accent6"/>
+        </w:rPr>
+        <w:t>Download python 3.10</w:t>
+      </w:r>
+      <w:r>
+        <w:rPr>
+          <w:b/>
+          <w:bCs/>
+          <w:color w:val="70AD47" w:themeColor="accent6"/>
+        </w:rPr>
+        <w:br/>
+        <w:t>Using its path</w:t>
+      </w:r>
+      <w:r>
+        <w:rPr>
+          <w:b/>
+          <w:bCs/>
+          <w:color w:val="70AD47" w:themeColor="accent6"/>
+        </w:rPr>
+        <w:t xml:space="preserve"> (our local laptop folder path written on top)</w:t>
+      </w:r>
+      <w:r>
+        <w:rPr>
+          <w:b/>
+          <w:bCs/>
+          <w:color w:val="70AD47" w:themeColor="accent6"/>
+        </w:rPr>
+        <w:t>, create environment variable</w:t>
       </w:r>
     </w:p>
     <w:p>
@@ -357,12 +474,237 @@
         <w:rPr>
           <w:b/>
           <w:bCs/>
-        </w:rPr>
-      </w:pPr>
+          <w:color w:val="70AD47" w:themeColor="accent6"/>
+        </w:rPr>
+      </w:pPr>
+      <w:r>
+        <w:rPr>
+          <w:b/>
+          <w:bCs/>
+          <w:color w:val="70AD47" w:themeColor="accent6"/>
+        </w:rPr>
+        <w:t>Then install Django, MySQL</w:t>
+      </w:r>
     </w:p>
     <w:p>
       <w:pPr>
         <w:pStyle w:val="ListParagraph"/>
+        <w:numPr>
+          <w:ilvl w:val="0"/>
+          <w:numId w:val="1"/>
+        </w:numPr>
+        <w:rPr>
+          <w:b/>
+          <w:bCs/>
+        </w:rPr>
+      </w:pPr>
+      <w:r>
+        <w:rPr>
+          <w:b/>
+          <w:bCs/>
+        </w:rPr>
+        <w:t xml:space="preserve">Got through the files for </w:t>
+      </w:r>
+      <w:proofErr w:type="spellStart"/>
+      <w:r>
+        <w:rPr>
+          <w:b/>
+          <w:bCs/>
+        </w:rPr>
+        <w:t>adhd</w:t>
+      </w:r>
+      <w:proofErr w:type="spellEnd"/>
+      <w:r>
+        <w:rPr>
+          <w:b/>
+          <w:bCs/>
+        </w:rPr>
+        <w:t>.</w:t>
+      </w:r>
+    </w:p>
+    <w:p>
+      <w:pPr>
+        <w:pStyle w:val="ListParagraph"/>
+        <w:numPr>
+          <w:ilvl w:val="0"/>
+          <w:numId w:val="1"/>
+        </w:numPr>
+        <w:rPr>
+          <w:b/>
+          <w:bCs/>
+        </w:rPr>
+      </w:pPr>
+      <w:r>
+        <w:rPr>
+          <w:b/>
+          <w:bCs/>
+        </w:rPr>
+        <w:t xml:space="preserve">First </w:t>
+      </w:r>
+      <w:proofErr w:type="spellStart"/>
+      <w:r>
+        <w:rPr>
+          <w:b/>
+          <w:bCs/>
+        </w:rPr>
+        <w:t>adhd</w:t>
+      </w:r>
+      <w:proofErr w:type="spellEnd"/>
+    </w:p>
+    <w:p>
+      <w:pPr>
+        <w:pStyle w:val="ListParagraph"/>
+        <w:rPr>
+          <w:b/>
+          <w:bCs/>
+        </w:rPr>
+      </w:pPr>
+      <w:r>
+        <w:rPr>
+          <w:b/>
+          <w:bCs/>
+        </w:rPr>
+        <w:t>For ADHD only need to print: Has ADHD or Doesn’t have ADHD</w:t>
+      </w:r>
+    </w:p>
+    <w:p>
+      <w:pPr>
+        <w:pStyle w:val="ListParagraph"/>
+        <w:rPr>
+          <w:b/>
+          <w:bCs/>
+        </w:rPr>
+      </w:pPr>
+    </w:p>
+    <w:p>
+      <w:pPr>
+        <w:rPr>
+          <w:b/>
+          <w:bCs/>
+          <w:color w:val="EE0000"/>
+          <w:sz w:val="40"/>
+          <w:szCs w:val="40"/>
+        </w:rPr>
+      </w:pPr>
+      <w:r>
+        <w:rPr>
+          <w:b/>
+          <w:bCs/>
+          <w:color w:val="EE0000"/>
+          <w:sz w:val="40"/>
+          <w:szCs w:val="40"/>
+        </w:rPr>
+        <w:t>Tasks Completed</w:t>
+      </w:r>
+    </w:p>
+    <w:p>
+      <w:pPr>
+        <w:rPr>
+          <w:b/>
+          <w:bCs/>
+        </w:rPr>
+      </w:pPr>
+      <w:r>
+        <w:rPr>
+          <w:b/>
+          <w:bCs/>
+        </w:rPr>
+        <w:t>Python 3.10 installed and configured</w:t>
+      </w:r>
+    </w:p>
+    <w:p>
+      <w:pPr>
+        <w:rPr>
+          <w:b/>
+          <w:bCs/>
+        </w:rPr>
+      </w:pPr>
+      <w:r>
+        <w:rPr>
+          <w:b/>
+          <w:bCs/>
+        </w:rPr>
+        <w:t>Django project running with Python 3.10</w:t>
+      </w:r>
+    </w:p>
+    <w:p>
+      <w:pPr>
+        <w:rPr>
+          <w:b/>
+          <w:bCs/>
+        </w:rPr>
+      </w:pPr>
+      <w:r>
+        <w:rPr>
+          <w:b/>
+          <w:bCs/>
+        </w:rPr>
+        <w:lastRenderedPageBreak/>
+        <w:t>ADHD prediction model loaded successfully</w:t>
+      </w:r>
+    </w:p>
+    <w:p>
+      <w:pPr>
+        <w:rPr>
+          <w:b/>
+          <w:bCs/>
+        </w:rPr>
+      </w:pPr>
+      <w:r>
+        <w:rPr>
+          <w:b/>
+          <w:bCs/>
+        </w:rPr>
+        <w:t>Prediction working: 56.39% probability of ADHD for the sample data</w:t>
+      </w:r>
+    </w:p>
+    <w:p>
+      <w:pPr>
+        <w:rPr>
+          <w:b/>
+          <w:bCs/>
+        </w:rPr>
+      </w:pPr>
+      <w:r>
+        <w:rPr>
+          <w:b/>
+          <w:bCs/>
+        </w:rPr>
+        <w:t>ADHD prediction function created</w:t>
+      </w:r>
+    </w:p>
+    <w:p>
+      <w:pPr>
+        <w:rPr>
+          <w:b/>
+          <w:bCs/>
+        </w:rPr>
+      </w:pPr>
+      <w:r>
+        <w:rPr>
+          <w:b/>
+          <w:bCs/>
+        </w:rPr>
+        <w:t>Django API endpoint for ADHD prediction</w:t>
+      </w:r>
+    </w:p>
+    <w:p>
+      <w:pPr>
+        <w:rPr>
+          <w:b/>
+          <w:bCs/>
+        </w:rPr>
+      </w:pPr>
+      <w:r>
+        <w:rPr>
+          <w:b/>
+          <w:bCs/>
+        </w:rPr>
+        <w:t>API tested and working: Returns "Has ADHD" or "Doesn't have ADHD"</w:t>
+      </w:r>
+    </w:p>
+    <w:p>
+      <w:pPr>
         <w:rPr>
           <w:b/>
           <w:bCs/>
@@ -390,7 +732,7 @@
                     <pic:cNvPicPr/>
                   </pic:nvPicPr>
                   <pic:blipFill>
-                    <a:blip r:embed="rId9"/>
+                    <a:blip r:embed="rId10"/>
                     <a:stretch>
                       <a:fillRect/>
                     </a:stretch>
@@ -512,8 +854,124 @@
       </w:pPr>
     </w:lvl>
   </w:abstractNum>
+  <w:abstractNum w:abstractNumId="1" w15:restartNumberingAfterBreak="0">
+    <w:nsid w:val="4EFB4430"/>
+    <w:multiLevelType w:val="multilevel"/>
+    <w:tmpl w:val="6330B17A"/>
+    <w:lvl w:ilvl="0">
+      <w:start w:val="1"/>
+      <w:numFmt w:val="decimal"/>
+      <w:lvlText w:val="%1."/>
+      <w:lvlJc w:val="left"/>
+      <w:pPr>
+        <w:tabs>
+          <w:tab w:val="num" w:pos="720"/>
+        </w:tabs>
+        <w:ind w:left="720" w:hanging="360"/>
+      </w:pPr>
+    </w:lvl>
+    <w:lvl w:ilvl="1" w:tentative="1">
+      <w:start w:val="1"/>
+      <w:numFmt w:val="decimal"/>
+      <w:lvlText w:val="%2."/>
+      <w:lvlJc w:val="left"/>
+      <w:pPr>
+        <w:tabs>
+          <w:tab w:val="num" w:pos="1440"/>
+        </w:tabs>
+        <w:ind w:left="1440" w:hanging="360"/>
+      </w:pPr>
+    </w:lvl>
+    <w:lvl w:ilvl="2" w:tentative="1">
+      <w:start w:val="1"/>
+      <w:numFmt w:val="decimal"/>
+      <w:lvlText w:val="%3."/>
+      <w:lvlJc w:val="left"/>
+      <w:pPr>
+        <w:tabs>
+          <w:tab w:val="num" w:pos="2160"/>
+        </w:tabs>
+        <w:ind w:left="2160" w:hanging="360"/>
+      </w:pPr>
+    </w:lvl>
+    <w:lvl w:ilvl="3" w:tentative="1">
+      <w:start w:val="1"/>
+      <w:numFmt w:val="decimal"/>
+      <w:lvlText w:val="%4."/>
+      <w:lvlJc w:val="left"/>
+      <w:pPr>
+        <w:tabs>
+          <w:tab w:val="num" w:pos="2880"/>
+        </w:tabs>
+        <w:ind w:left="2880" w:hanging="360"/>
+      </w:pPr>
+    </w:lvl>
+    <w:lvl w:ilvl="4" w:tentative="1">
+      <w:start w:val="1"/>
+      <w:numFmt w:val="decimal"/>
+      <w:lvlText w:val="%5."/>
+      <w:lvlJc w:val="left"/>
+      <w:pPr>
+        <w:tabs>
+          <w:tab w:val="num" w:pos="3600"/>
+        </w:tabs>
+        <w:ind w:left="3600" w:hanging="360"/>
+      </w:pPr>
+    </w:lvl>
+    <w:lvl w:ilvl="5" w:tentative="1">
+      <w:start w:val="1"/>
+      <w:numFmt w:val="decimal"/>
+      <w:lvlText w:val="%6."/>
+      <w:lvlJc w:val="left"/>
+      <w:pPr>
+        <w:tabs>
+          <w:tab w:val="num" w:pos="4320"/>
+        </w:tabs>
+        <w:ind w:left="4320" w:hanging="360"/>
+      </w:pPr>
+    </w:lvl>
+    <w:lvl w:ilvl="6" w:tentative="1">
+      <w:start w:val="1"/>
+      <w:numFmt w:val="decimal"/>
+      <w:lvlText w:val="%7."/>
+      <w:lvlJc w:val="left"/>
+      <w:pPr>
+        <w:tabs>
+          <w:tab w:val="num" w:pos="5040"/>
+        </w:tabs>
+        <w:ind w:left="5040" w:hanging="360"/>
+      </w:pPr>
+    </w:lvl>
+    <w:lvl w:ilvl="7" w:tentative="1">
+      <w:start w:val="1"/>
+      <w:numFmt w:val="decimal"/>
+      <w:lvlText w:val="%8."/>
+      <w:lvlJc w:val="left"/>
+      <w:pPr>
+        <w:tabs>
+          <w:tab w:val="num" w:pos="5760"/>
+        </w:tabs>
+        <w:ind w:left="5760" w:hanging="360"/>
+      </w:pPr>
+    </w:lvl>
+    <w:lvl w:ilvl="8" w:tentative="1">
+      <w:start w:val="1"/>
+      <w:numFmt w:val="decimal"/>
+      <w:lvlText w:val="%9."/>
+      <w:lvlJc w:val="left"/>
+      <w:pPr>
+        <w:tabs>
+          <w:tab w:val="num" w:pos="6480"/>
+        </w:tabs>
+        <w:ind w:left="6480" w:hanging="360"/>
+      </w:pPr>
+    </w:lvl>
+  </w:abstractNum>
   <w:num w:numId="1" w16cid:durableId="1153913156">
     <w:abstractNumId w:val="0"/>
+  </w:num>
+  <w:num w:numId="2" w16cid:durableId="530651646">
+    <w:abstractNumId w:val="1"/>
   </w:num>
 </w:numbering>
 </file>

</xml_diff>